<commit_message>
Updated all the files and folders and cleaned up some.
</commit_message>
<xml_diff>
--- a/javascript-reference/js-contents.docx
+++ b/javascript-reference/js-contents.docx
@@ -2559,7 +2559,49 @@
           <w:sz w:val="24"/>
           <w:szCs w:val="24"/>
         </w:rPr>
-        <w:t>First order function</w:t>
+        <w:t>Unary function</w:t>
+      </w:r>
+      <w:r>
+        <w:rPr>
+          <w:sz w:val="24"/>
+          <w:szCs w:val="24"/>
+        </w:rPr>
+        <w:t xml:space="preserve"> –</w:t>
+      </w:r>
+      <w:r>
+        <w:rPr>
+          <w:sz w:val="24"/>
+          <w:szCs w:val="24"/>
+        </w:rPr>
+        <w:t xml:space="preserve"> </w:t>
+      </w:r>
+      <w:r>
+        <w:rPr>
+          <w:sz w:val="24"/>
+          <w:szCs w:val="24"/>
+        </w:rPr>
+        <w:t>[</w:t>
+      </w:r>
+      <w:r>
+        <w:rPr>
+          <w:sz w:val="24"/>
+          <w:szCs w:val="24"/>
+        </w:rPr>
+        <w:t>validation testing, event handling, currying</w:t>
+      </w:r>
+      <w:r>
+        <w:rPr>
+          <w:sz w:val="24"/>
+          <w:szCs w:val="24"/>
+        </w:rPr>
+        <w:t>]</w:t>
+      </w:r>
+      <w:r>
+        <w:rPr>
+          <w:sz w:val="24"/>
+          <w:szCs w:val="24"/>
+        </w:rPr>
+        <w:t xml:space="preserve"> Monadic</w:t>
       </w:r>
     </w:p>
     <w:p>
@@ -2579,42 +2621,7 @@
           <w:sz w:val="24"/>
           <w:szCs w:val="24"/>
         </w:rPr>
-        <w:t>Unary function</w:t>
-      </w:r>
-      <w:r>
-        <w:rPr>
-          <w:sz w:val="24"/>
-          <w:szCs w:val="24"/>
-        </w:rPr>
-        <w:t xml:space="preserve"> –</w:t>
-      </w:r>
-      <w:r>
-        <w:rPr>
-          <w:sz w:val="24"/>
-          <w:szCs w:val="24"/>
-        </w:rPr>
-        <w:t xml:space="preserve"> </w:t>
-      </w:r>
-      <w:r>
-        <w:rPr>
-          <w:sz w:val="24"/>
-          <w:szCs w:val="24"/>
-        </w:rPr>
-        <w:t>[</w:t>
-      </w:r>
-      <w:r>
-        <w:rPr>
-          <w:sz w:val="24"/>
-          <w:szCs w:val="24"/>
-        </w:rPr>
-        <w:t>validation testing, event handling, currying</w:t>
-      </w:r>
-      <w:r>
-        <w:rPr>
-          <w:sz w:val="24"/>
-          <w:szCs w:val="24"/>
-        </w:rPr>
-        <w:t>]</w:t>
+        <w:t>Binary Function vs Polyadic Function</w:t>
       </w:r>
     </w:p>
     <w:p>
@@ -7197,6 +7204,7 @@
   <w:style w:type="character" w:default="1" w:styleId="DefaultParagraphFont">
     <w:name w:val="Default Paragraph Font"/>
     <w:uiPriority w:val="1"/>
+    <w:semiHidden/>
     <w:unhideWhenUsed/>
   </w:style>
   <w:style w:type="table" w:default="1" w:styleId="TableNormal">

</xml_diff>

<commit_message>
Updated all the files and folders in javascript
</commit_message>
<xml_diff>
--- a/javascript-reference/js-contents.docx
+++ b/javascript-reference/js-contents.docx
@@ -1511,7 +1511,7 @@
           <w:sz w:val="24"/>
           <w:szCs w:val="24"/>
         </w:rPr>
-        <w:t>2</w:t>
+        <w:t>3</w:t>
       </w:r>
       <w:r>
         <w:rPr>
@@ -1545,89 +1545,7 @@
           <w:sz w:val="24"/>
           <w:szCs w:val="24"/>
         </w:rPr>
-        <w:t>35]</w:t>
-      </w:r>
-    </w:p>
-    <w:p>
-      <w:pPr>
-        <w:pStyle w:val="ListParagraph"/>
-        <w:numPr>
-          <w:ilvl w:val="1"/>
-          <w:numId w:val="1"/>
-        </w:numPr>
-        <w:rPr>
-          <w:sz w:val="24"/>
-          <w:szCs w:val="24"/>
-        </w:rPr>
-      </w:pPr>
-      <w:r>
-        <w:rPr>
-          <w:sz w:val="24"/>
-          <w:szCs w:val="24"/>
-        </w:rPr>
-        <w:t>Excluded: constructor, prototype, localCompare (</w:t>
-      </w:r>
-      <w:r>
-        <w:rPr>
-          <w:sz w:val="24"/>
-          <w:szCs w:val="24"/>
-        </w:rPr>
-        <w:t>)</w:t>
-      </w:r>
-    </w:p>
-    <w:p>
-      <w:pPr>
-        <w:pStyle w:val="ListParagraph"/>
-        <w:numPr>
-          <w:ilvl w:val="0"/>
-          <w:numId w:val="1"/>
-        </w:numPr>
-        <w:rPr>
-          <w:sz w:val="24"/>
-          <w:szCs w:val="24"/>
-        </w:rPr>
-      </w:pPr>
-      <w:r>
-        <w:rPr>
-          <w:sz w:val="24"/>
-          <w:szCs w:val="24"/>
-        </w:rPr>
-        <w:t>JS Array</w:t>
-      </w:r>
-      <w:r>
-        <w:rPr>
-          <w:sz w:val="24"/>
-          <w:szCs w:val="24"/>
-        </w:rPr>
-        <w:t xml:space="preserve"> </w:t>
-      </w:r>
-      <w:r>
-        <w:rPr>
-          <w:sz w:val="24"/>
-          <w:szCs w:val="24"/>
-        </w:rPr>
-        <w:t>m</w:t>
-      </w:r>
-      <w:r>
-        <w:rPr>
-          <w:sz w:val="24"/>
-          <w:szCs w:val="24"/>
-        </w:rPr>
-        <w:t>ethods</w:t>
-      </w:r>
-      <w:r>
-        <w:rPr>
-          <w:sz w:val="24"/>
-          <w:szCs w:val="24"/>
-        </w:rPr>
-        <w:t xml:space="preserve"> – </w:t>
-      </w:r>
-      <w:r>
-        <w:rPr>
-          <w:sz w:val="24"/>
-          <w:szCs w:val="24"/>
-        </w:rPr>
-        <w:t xml:space="preserve">43 </w:t>
+        <w:t>3</w:t>
       </w:r>
       <w:r>
         <w:rPr>
@@ -1636,7 +1554,7 @@
           <w:sz w:val="24"/>
           <w:szCs w:val="24"/>
         </w:rPr>
-        <w:t>[</w:t>
+        <w:t>6</w:t>
       </w:r>
       <w:r>
         <w:rPr>
@@ -1645,7 +1563,89 @@
           <w:sz w:val="24"/>
           <w:szCs w:val="24"/>
         </w:rPr>
-        <w:t>Total –</w:t>
+        <w:t>]</w:t>
+      </w:r>
+    </w:p>
+    <w:p>
+      <w:pPr>
+        <w:pStyle w:val="ListParagraph"/>
+        <w:numPr>
+          <w:ilvl w:val="1"/>
+          <w:numId w:val="1"/>
+        </w:numPr>
+        <w:rPr>
+          <w:sz w:val="24"/>
+          <w:szCs w:val="24"/>
+        </w:rPr>
+      </w:pPr>
+      <w:r>
+        <w:rPr>
+          <w:sz w:val="24"/>
+          <w:szCs w:val="24"/>
+        </w:rPr>
+        <w:t>Excluded: constructor, prototype, localCompare (</w:t>
+      </w:r>
+      <w:r>
+        <w:rPr>
+          <w:sz w:val="24"/>
+          <w:szCs w:val="24"/>
+        </w:rPr>
+        <w:t>)</w:t>
+      </w:r>
+    </w:p>
+    <w:p>
+      <w:pPr>
+        <w:pStyle w:val="ListParagraph"/>
+        <w:numPr>
+          <w:ilvl w:val="0"/>
+          <w:numId w:val="1"/>
+        </w:numPr>
+        <w:rPr>
+          <w:sz w:val="24"/>
+          <w:szCs w:val="24"/>
+        </w:rPr>
+      </w:pPr>
+      <w:r>
+        <w:rPr>
+          <w:sz w:val="24"/>
+          <w:szCs w:val="24"/>
+        </w:rPr>
+        <w:t>JS Array</w:t>
+      </w:r>
+      <w:r>
+        <w:rPr>
+          <w:sz w:val="24"/>
+          <w:szCs w:val="24"/>
+        </w:rPr>
+        <w:t xml:space="preserve"> </w:t>
+      </w:r>
+      <w:r>
+        <w:rPr>
+          <w:sz w:val="24"/>
+          <w:szCs w:val="24"/>
+        </w:rPr>
+        <w:t>m</w:t>
+      </w:r>
+      <w:r>
+        <w:rPr>
+          <w:sz w:val="24"/>
+          <w:szCs w:val="24"/>
+        </w:rPr>
+        <w:t>ethods</w:t>
+      </w:r>
+      <w:r>
+        <w:rPr>
+          <w:sz w:val="24"/>
+          <w:szCs w:val="24"/>
+        </w:rPr>
+        <w:t xml:space="preserve"> – </w:t>
+      </w:r>
+      <w:r>
+        <w:rPr>
+          <w:sz w:val="24"/>
+          <w:szCs w:val="24"/>
+        </w:rPr>
+        <w:t xml:space="preserve">43 </w:t>
       </w:r>
       <w:r>
         <w:rPr>
@@ -1654,7 +1654,7 @@
           <w:sz w:val="24"/>
           <w:szCs w:val="24"/>
         </w:rPr>
-        <w:t xml:space="preserve"> 4</w:t>
+        <w:t>[</w:t>
       </w:r>
       <w:r>
         <w:rPr>
@@ -1663,7 +1663,7 @@
           <w:sz w:val="24"/>
           <w:szCs w:val="24"/>
         </w:rPr>
-        <w:t>5</w:t>
+        <w:t>Total –</w:t>
       </w:r>
       <w:r>
         <w:rPr>
@@ -1672,81 +1672,7 @@
           <w:sz w:val="24"/>
           <w:szCs w:val="24"/>
         </w:rPr>
-        <w:t>]</w:t>
-      </w:r>
-    </w:p>
-    <w:p>
-      <w:pPr>
-        <w:pStyle w:val="ListParagraph"/>
-        <w:numPr>
-          <w:ilvl w:val="1"/>
-          <w:numId w:val="1"/>
-        </w:numPr>
-        <w:rPr>
-          <w:sz w:val="24"/>
-          <w:szCs w:val="24"/>
-        </w:rPr>
-      </w:pPr>
-      <w:r>
-        <w:rPr>
-          <w:sz w:val="24"/>
-          <w:szCs w:val="24"/>
-        </w:rPr>
-        <w:t>Excluded: constructor</w:t>
-      </w:r>
-      <w:r>
-        <w:rPr>
-          <w:sz w:val="24"/>
-          <w:szCs w:val="24"/>
-        </w:rPr>
-        <w:t>, Array ()</w:t>
-      </w:r>
-    </w:p>
-    <w:p>
-      <w:pPr>
-        <w:pStyle w:val="ListParagraph"/>
-        <w:numPr>
-          <w:ilvl w:val="0"/>
-          <w:numId w:val="1"/>
-        </w:numPr>
-        <w:rPr>
-          <w:sz w:val="24"/>
-          <w:szCs w:val="24"/>
-        </w:rPr>
-      </w:pPr>
-      <w:r>
-        <w:rPr>
-          <w:sz w:val="24"/>
-          <w:szCs w:val="24"/>
-        </w:rPr>
-        <w:t>JS Objects</w:t>
-      </w:r>
-    </w:p>
-    <w:p>
-      <w:pPr>
-        <w:pStyle w:val="ListParagraph"/>
-        <w:numPr>
-          <w:ilvl w:val="1"/>
-          <w:numId w:val="1"/>
-        </w:numPr>
-        <w:rPr>
-          <w:sz w:val="24"/>
-          <w:szCs w:val="24"/>
-        </w:rPr>
-      </w:pPr>
-      <w:r>
-        <w:rPr>
-          <w:sz w:val="24"/>
-          <w:szCs w:val="24"/>
-        </w:rPr>
-        <w:t xml:space="preserve">Object Definitions – </w:t>
-      </w:r>
-      <w:r>
-        <w:rPr>
-          <w:sz w:val="24"/>
-          <w:szCs w:val="24"/>
-        </w:rPr>
-        <w:t xml:space="preserve">Object literal, using </w:t>
+        <w:t xml:space="preserve"> 4</w:t>
       </w:r>
       <w:r>
         <w:rPr>
@@ -1755,498 +1681,7 @@
           <w:sz w:val="24"/>
           <w:szCs w:val="24"/>
         </w:rPr>
-        <w:t>new</w:t>
-      </w:r>
-      <w:r>
-        <w:rPr>
-          <w:sz w:val="24"/>
-          <w:szCs w:val="24"/>
-        </w:rPr>
-        <w:t xml:space="preserve"> keyword, </w:t>
-      </w:r>
-      <w:r>
-        <w:rPr>
-          <w:sz w:val="24"/>
-          <w:szCs w:val="24"/>
-        </w:rPr>
-        <w:t>object. create (</w:t>
-      </w:r>
-      <w:r>
-        <w:rPr>
-          <w:sz w:val="24"/>
-          <w:szCs w:val="24"/>
-        </w:rPr>
-        <w:t>),</w:t>
-      </w:r>
-      <w:r>
-        <w:rPr>
-          <w:sz w:val="24"/>
-          <w:szCs w:val="24"/>
-        </w:rPr>
-        <w:t xml:space="preserve"> </w:t>
-      </w:r>
-      <w:r>
-        <w:rPr>
-          <w:sz w:val="24"/>
-          <w:szCs w:val="24"/>
-        </w:rPr>
-        <w:t>Function constructor</w:t>
-      </w:r>
-      <w:r>
-        <w:rPr>
-          <w:sz w:val="24"/>
-          <w:szCs w:val="24"/>
-        </w:rPr>
-        <w:t>, ES6 classes</w:t>
-      </w:r>
-    </w:p>
-    <w:p>
-      <w:pPr>
-        <w:pStyle w:val="ListParagraph"/>
-        <w:numPr>
-          <w:ilvl w:val="1"/>
-          <w:numId w:val="1"/>
-        </w:numPr>
-        <w:rPr>
-          <w:sz w:val="24"/>
-          <w:szCs w:val="24"/>
-        </w:rPr>
-      </w:pPr>
-      <w:r>
-        <w:rPr>
-          <w:sz w:val="24"/>
-          <w:szCs w:val="24"/>
-        </w:rPr>
-        <w:t>Object Properties</w:t>
-      </w:r>
-    </w:p>
-    <w:p>
-      <w:pPr>
-        <w:pStyle w:val="ListParagraph"/>
-        <w:numPr>
-          <w:ilvl w:val="2"/>
-          <w:numId w:val="1"/>
-        </w:numPr>
-        <w:rPr>
-          <w:sz w:val="24"/>
-          <w:szCs w:val="24"/>
-        </w:rPr>
-      </w:pPr>
-      <w:r>
-        <w:rPr>
-          <w:sz w:val="24"/>
-          <w:szCs w:val="24"/>
-        </w:rPr>
-        <w:t>Bracket notation –</w:t>
-      </w:r>
-      <w:r>
-        <w:rPr>
-          <w:sz w:val="24"/>
-          <w:szCs w:val="24"/>
-        </w:rPr>
-        <w:t xml:space="preserve"> dot notation</w:t>
-      </w:r>
-      <w:r>
-        <w:rPr>
-          <w:sz w:val="24"/>
-          <w:szCs w:val="24"/>
-        </w:rPr>
-        <w:t xml:space="preserve"> – </w:t>
-      </w:r>
-      <w:r>
-        <w:rPr>
-          <w:sz w:val="24"/>
-          <w:szCs w:val="24"/>
-        </w:rPr>
-        <w:t>loop through</w:t>
-      </w:r>
-      <w:r>
-        <w:rPr>
-          <w:sz w:val="24"/>
-          <w:szCs w:val="24"/>
-        </w:rPr>
-        <w:t xml:space="preserve"> – </w:t>
-      </w:r>
-      <w:r>
-        <w:rPr>
-          <w:sz w:val="24"/>
-          <w:szCs w:val="24"/>
-        </w:rPr>
-        <w:t xml:space="preserve">object. </w:t>
-      </w:r>
-      <w:r>
-        <w:rPr>
-          <w:sz w:val="24"/>
-          <w:szCs w:val="24"/>
-        </w:rPr>
-        <w:t>v</w:t>
-      </w:r>
-      <w:r>
-        <w:rPr>
-          <w:sz w:val="24"/>
-          <w:szCs w:val="24"/>
-        </w:rPr>
-        <w:t>alues</w:t>
-      </w:r>
-      <w:r>
-        <w:rPr>
-          <w:sz w:val="24"/>
-          <w:szCs w:val="24"/>
-        </w:rPr>
-        <w:t xml:space="preserve"> </w:t>
-      </w:r>
-      <w:r>
-        <w:rPr>
-          <w:sz w:val="24"/>
-          <w:szCs w:val="24"/>
-        </w:rPr>
-        <w:t>() – JSON.stringify(object name)</w:t>
-      </w:r>
-    </w:p>
-    <w:p>
-      <w:pPr>
-        <w:pStyle w:val="ListParagraph"/>
-        <w:numPr>
-          <w:ilvl w:val="2"/>
-          <w:numId w:val="1"/>
-        </w:numPr>
-        <w:rPr>
-          <w:color w:val="FF0000"/>
-          <w:sz w:val="24"/>
-          <w:szCs w:val="24"/>
-        </w:rPr>
-      </w:pPr>
-      <w:r>
-        <w:rPr>
-          <w:color w:val="FF0000"/>
-          <w:sz w:val="24"/>
-          <w:szCs w:val="24"/>
-        </w:rPr>
-        <w:t xml:space="preserve">While looping through object, we can’t get </w:t>
-      </w:r>
-      <w:r>
-        <w:rPr>
-          <w:color w:val="FF0000"/>
-          <w:sz w:val="24"/>
-          <w:szCs w:val="24"/>
-        </w:rPr>
-        <w:t xml:space="preserve">nested object </w:t>
-      </w:r>
-      <w:r>
-        <w:rPr>
-          <w:color w:val="FF0000"/>
-          <w:sz w:val="24"/>
-          <w:szCs w:val="24"/>
-        </w:rPr>
-        <w:t>value.</w:t>
-      </w:r>
-      <w:r>
-        <w:rPr>
-          <w:color w:val="FF0000"/>
-          <w:sz w:val="24"/>
-          <w:szCs w:val="24"/>
-        </w:rPr>
-        <w:t xml:space="preserve"> How to fix it</w:t>
-      </w:r>
-      <w:r>
-        <w:rPr>
-          <w:color w:val="FF0000"/>
-          <w:sz w:val="24"/>
-          <w:szCs w:val="24"/>
-        </w:rPr>
-        <w:t>?</w:t>
-      </w:r>
-    </w:p>
-    <w:p>
-      <w:pPr>
-        <w:pStyle w:val="ListParagraph"/>
-        <w:numPr>
-          <w:ilvl w:val="2"/>
-          <w:numId w:val="1"/>
-        </w:numPr>
-        <w:rPr>
-          <w:sz w:val="24"/>
-          <w:szCs w:val="24"/>
-        </w:rPr>
-      </w:pPr>
-      <w:r>
-        <w:rPr>
-          <w:sz w:val="24"/>
-          <w:szCs w:val="24"/>
-        </w:rPr>
-        <w:t>How to add/delete/update the properties of objects</w:t>
-      </w:r>
-    </w:p>
-    <w:p>
-      <w:pPr>
-        <w:pStyle w:val="ListParagraph"/>
-        <w:numPr>
-          <w:ilvl w:val="2"/>
-          <w:numId w:val="1"/>
-        </w:numPr>
-        <w:rPr>
-          <w:sz w:val="24"/>
-          <w:szCs w:val="24"/>
-        </w:rPr>
-      </w:pPr>
-      <w:r>
-        <w:rPr>
-          <w:sz w:val="24"/>
-          <w:szCs w:val="24"/>
-        </w:rPr>
-        <w:t xml:space="preserve">Property attributes </w:t>
-      </w:r>
-      <w:r>
-        <w:rPr>
-          <w:sz w:val="24"/>
-          <w:szCs w:val="24"/>
-        </w:rPr>
-        <w:t>– writable, enumerable, configurable</w:t>
-      </w:r>
-    </w:p>
-    <w:p>
-      <w:pPr>
-        <w:pStyle w:val="ListParagraph"/>
-        <w:numPr>
-          <w:ilvl w:val="2"/>
-          <w:numId w:val="1"/>
-        </w:numPr>
-        <w:rPr>
-          <w:color w:val="FF0000"/>
-          <w:sz w:val="24"/>
-          <w:szCs w:val="24"/>
-        </w:rPr>
-      </w:pPr>
-      <w:r>
-        <w:rPr>
-          <w:color w:val="FF0000"/>
-          <w:sz w:val="24"/>
-          <w:szCs w:val="24"/>
-        </w:rPr>
-        <w:t>Prototype property and what will happen if we delete prototype property?</w:t>
-      </w:r>
-    </w:p>
-    <w:p>
-      <w:pPr>
-        <w:pStyle w:val="ListParagraph"/>
-        <w:numPr>
-          <w:ilvl w:val="1"/>
-          <w:numId w:val="1"/>
-        </w:numPr>
-        <w:rPr>
-          <w:sz w:val="24"/>
-          <w:szCs w:val="24"/>
-        </w:rPr>
-      </w:pPr>
-      <w:r>
-        <w:rPr>
-          <w:sz w:val="24"/>
-          <w:szCs w:val="24"/>
-        </w:rPr>
-        <w:t xml:space="preserve">Object Accessors </w:t>
-      </w:r>
-      <w:r>
-        <w:rPr>
-          <w:sz w:val="24"/>
-          <w:szCs w:val="24"/>
-        </w:rPr>
-        <w:t>–</w:t>
-      </w:r>
-      <w:r>
-        <w:rPr>
-          <w:sz w:val="24"/>
-          <w:szCs w:val="24"/>
-        </w:rPr>
-        <w:t xml:space="preserve"> </w:t>
-      </w:r>
-      <w:r>
-        <w:rPr>
-          <w:sz w:val="24"/>
-          <w:szCs w:val="24"/>
-        </w:rPr>
-        <w:t>Setters and Getters</w:t>
-      </w:r>
-    </w:p>
-    <w:p>
-      <w:pPr>
-        <w:pStyle w:val="ListParagraph"/>
-        <w:numPr>
-          <w:ilvl w:val="1"/>
-          <w:numId w:val="1"/>
-        </w:numPr>
-        <w:rPr>
-          <w:sz w:val="24"/>
-          <w:szCs w:val="24"/>
-        </w:rPr>
-      </w:pPr>
-      <w:r>
-        <w:rPr>
-          <w:sz w:val="24"/>
-          <w:szCs w:val="24"/>
-        </w:rPr>
-        <w:t>Object Constructor</w:t>
-      </w:r>
-      <w:r>
-        <w:rPr>
-          <w:sz w:val="24"/>
-          <w:szCs w:val="24"/>
-        </w:rPr>
-        <w:t xml:space="preserve"> (Object Constructor Function)</w:t>
-      </w:r>
-    </w:p>
-    <w:p>
-      <w:pPr>
-        <w:pStyle w:val="ListParagraph"/>
-        <w:numPr>
-          <w:ilvl w:val="2"/>
-          <w:numId w:val="1"/>
-        </w:numPr>
-        <w:rPr>
-          <w:sz w:val="24"/>
-          <w:szCs w:val="24"/>
-        </w:rPr>
-      </w:pPr>
-      <w:r>
-        <w:rPr>
-          <w:sz w:val="24"/>
-          <w:szCs w:val="24"/>
-        </w:rPr>
-        <w:t>How to add properties and methods to object</w:t>
-      </w:r>
-    </w:p>
-    <w:p>
-      <w:pPr>
-        <w:pStyle w:val="ListParagraph"/>
-        <w:numPr>
-          <w:ilvl w:val="2"/>
-          <w:numId w:val="1"/>
-        </w:numPr>
-        <w:rPr>
-          <w:sz w:val="24"/>
-          <w:szCs w:val="24"/>
-        </w:rPr>
-      </w:pPr>
-      <w:r>
-        <w:rPr>
-          <w:sz w:val="24"/>
-          <w:szCs w:val="24"/>
-        </w:rPr>
-        <w:t>How to add properties and methods to object constructor</w:t>
-      </w:r>
-    </w:p>
-    <w:p>
-      <w:pPr>
-        <w:pStyle w:val="ListParagraph"/>
-        <w:numPr>
-          <w:ilvl w:val="1"/>
-          <w:numId w:val="1"/>
-        </w:numPr>
-        <w:rPr>
-          <w:sz w:val="24"/>
-          <w:szCs w:val="24"/>
-        </w:rPr>
-      </w:pPr>
-      <w:r>
-        <w:rPr>
-          <w:sz w:val="24"/>
-          <w:szCs w:val="24"/>
-        </w:rPr>
-        <w:t>Object Prototype</w:t>
-      </w:r>
-    </w:p>
-    <w:p>
-      <w:pPr>
-        <w:pStyle w:val="ListParagraph"/>
-        <w:numPr>
-          <w:ilvl w:val="2"/>
-          <w:numId w:val="1"/>
-        </w:numPr>
-        <w:rPr>
-          <w:sz w:val="24"/>
-          <w:szCs w:val="24"/>
-        </w:rPr>
-      </w:pPr>
-      <w:r>
-        <w:rPr>
-          <w:sz w:val="24"/>
-          <w:szCs w:val="24"/>
-        </w:rPr>
-        <w:t>Prototype – Prototype chain</w:t>
-      </w:r>
-      <w:r>
-        <w:rPr>
-          <w:sz w:val="24"/>
-          <w:szCs w:val="24"/>
-        </w:rPr>
-        <w:t>/Prototypal inheritance</w:t>
-      </w:r>
-    </w:p>
-    <w:p>
-      <w:pPr>
-        <w:pStyle w:val="ListParagraph"/>
-        <w:numPr>
-          <w:ilvl w:val="2"/>
-          <w:numId w:val="1"/>
-        </w:numPr>
-        <w:rPr>
-          <w:sz w:val="24"/>
-          <w:szCs w:val="24"/>
-        </w:rPr>
-      </w:pPr>
-      <w:r>
-        <w:rPr>
-          <w:sz w:val="24"/>
-          <w:szCs w:val="24"/>
-        </w:rPr>
-        <w:t>How to add property and methods to object</w:t>
-      </w:r>
-      <w:r>
-        <w:rPr>
-          <w:sz w:val="24"/>
-          <w:szCs w:val="24"/>
-        </w:rPr>
-        <w:t xml:space="preserve"> constructor</w:t>
-      </w:r>
-      <w:r>
-        <w:rPr>
-          <w:sz w:val="24"/>
-          <w:szCs w:val="24"/>
-        </w:rPr>
-        <w:t xml:space="preserve"> using prototype</w:t>
-      </w:r>
-    </w:p>
-    <w:p>
-      <w:pPr>
-        <w:pStyle w:val="ListParagraph"/>
-        <w:numPr>
-          <w:ilvl w:val="1"/>
-          <w:numId w:val="1"/>
-        </w:numPr>
-        <w:rPr>
-          <w:sz w:val="24"/>
-          <w:szCs w:val="24"/>
-        </w:rPr>
-      </w:pPr>
-      <w:r>
-        <w:rPr>
-          <w:sz w:val="24"/>
-          <w:szCs w:val="24"/>
-        </w:rPr>
-        <w:t>Object Methods</w:t>
-      </w:r>
-      <w:r>
-        <w:rPr>
-          <w:sz w:val="24"/>
-          <w:szCs w:val="24"/>
-        </w:rPr>
-        <w:t xml:space="preserve"> –</w:t>
-      </w:r>
-      <w:r>
-        <w:rPr>
-          <w:sz w:val="24"/>
-          <w:szCs w:val="24"/>
-        </w:rPr>
-        <w:t xml:space="preserve"> </w:t>
+        <w:t>5</w:t>
       </w:r>
       <w:r>
         <w:rPr>
@@ -2255,7 +1690,81 @@
           <w:sz w:val="24"/>
           <w:szCs w:val="24"/>
         </w:rPr>
-        <w:t>[nearly 2</w:t>
+        <w:t>]</w:t>
+      </w:r>
+    </w:p>
+    <w:p>
+      <w:pPr>
+        <w:pStyle w:val="ListParagraph"/>
+        <w:numPr>
+          <w:ilvl w:val="1"/>
+          <w:numId w:val="1"/>
+        </w:numPr>
+        <w:rPr>
+          <w:sz w:val="24"/>
+          <w:szCs w:val="24"/>
+        </w:rPr>
+      </w:pPr>
+      <w:r>
+        <w:rPr>
+          <w:sz w:val="24"/>
+          <w:szCs w:val="24"/>
+        </w:rPr>
+        <w:t>Excluded: constructor</w:t>
+      </w:r>
+      <w:r>
+        <w:rPr>
+          <w:sz w:val="24"/>
+          <w:szCs w:val="24"/>
+        </w:rPr>
+        <w:t>, Array ()</w:t>
+      </w:r>
+    </w:p>
+    <w:p>
+      <w:pPr>
+        <w:pStyle w:val="ListParagraph"/>
+        <w:numPr>
+          <w:ilvl w:val="0"/>
+          <w:numId w:val="1"/>
+        </w:numPr>
+        <w:rPr>
+          <w:sz w:val="24"/>
+          <w:szCs w:val="24"/>
+        </w:rPr>
+      </w:pPr>
+      <w:r>
+        <w:rPr>
+          <w:sz w:val="24"/>
+          <w:szCs w:val="24"/>
+        </w:rPr>
+        <w:t>JS Objects</w:t>
+      </w:r>
+    </w:p>
+    <w:p>
+      <w:pPr>
+        <w:pStyle w:val="ListParagraph"/>
+        <w:numPr>
+          <w:ilvl w:val="1"/>
+          <w:numId w:val="1"/>
+        </w:numPr>
+        <w:rPr>
+          <w:sz w:val="24"/>
+          <w:szCs w:val="24"/>
+        </w:rPr>
+      </w:pPr>
+      <w:r>
+        <w:rPr>
+          <w:sz w:val="24"/>
+          <w:szCs w:val="24"/>
+        </w:rPr>
+        <w:t xml:space="preserve">Object Definitions – </w:t>
+      </w:r>
+      <w:r>
+        <w:rPr>
+          <w:sz w:val="24"/>
+          <w:szCs w:val="24"/>
+        </w:rPr>
+        <w:t xml:space="preserve">Object literal, using </w:t>
       </w:r>
       <w:r>
         <w:rPr>
@@ -2264,7 +1773,512 @@
           <w:sz w:val="24"/>
           <w:szCs w:val="24"/>
         </w:rPr>
-        <w:t>7</w:t>
+        <w:t>new</w:t>
+      </w:r>
+      <w:r>
+        <w:rPr>
+          <w:sz w:val="24"/>
+          <w:szCs w:val="24"/>
+        </w:rPr>
+        <w:t xml:space="preserve"> keyword, </w:t>
+      </w:r>
+      <w:r>
+        <w:rPr>
+          <w:sz w:val="24"/>
+          <w:szCs w:val="24"/>
+        </w:rPr>
+        <w:t>object. create (</w:t>
+      </w:r>
+      <w:r>
+        <w:rPr>
+          <w:sz w:val="24"/>
+          <w:szCs w:val="24"/>
+        </w:rPr>
+        <w:t>),</w:t>
+      </w:r>
+      <w:r>
+        <w:rPr>
+          <w:sz w:val="24"/>
+          <w:szCs w:val="24"/>
+        </w:rPr>
+        <w:t xml:space="preserve"> </w:t>
+      </w:r>
+      <w:r>
+        <w:rPr>
+          <w:sz w:val="24"/>
+          <w:szCs w:val="24"/>
+        </w:rPr>
+        <w:t>Function constructor</w:t>
+      </w:r>
+      <w:r>
+        <w:rPr>
+          <w:sz w:val="24"/>
+          <w:szCs w:val="24"/>
+        </w:rPr>
+        <w:t>, ES6 classes</w:t>
+      </w:r>
+    </w:p>
+    <w:p>
+      <w:pPr>
+        <w:pStyle w:val="ListParagraph"/>
+        <w:numPr>
+          <w:ilvl w:val="1"/>
+          <w:numId w:val="1"/>
+        </w:numPr>
+        <w:rPr>
+          <w:sz w:val="24"/>
+          <w:szCs w:val="24"/>
+        </w:rPr>
+      </w:pPr>
+      <w:r>
+        <w:rPr>
+          <w:sz w:val="24"/>
+          <w:szCs w:val="24"/>
+        </w:rPr>
+        <w:t>Object Properties</w:t>
+      </w:r>
+    </w:p>
+    <w:p>
+      <w:pPr>
+        <w:pStyle w:val="ListParagraph"/>
+        <w:numPr>
+          <w:ilvl w:val="2"/>
+          <w:numId w:val="1"/>
+        </w:numPr>
+        <w:rPr>
+          <w:sz w:val="24"/>
+          <w:szCs w:val="24"/>
+        </w:rPr>
+      </w:pPr>
+      <w:r>
+        <w:rPr>
+          <w:sz w:val="24"/>
+          <w:szCs w:val="24"/>
+        </w:rPr>
+        <w:t>Bracket notation –</w:t>
+      </w:r>
+      <w:r>
+        <w:rPr>
+          <w:sz w:val="24"/>
+          <w:szCs w:val="24"/>
+        </w:rPr>
+        <w:t xml:space="preserve"> dot notation</w:t>
+      </w:r>
+      <w:r>
+        <w:rPr>
+          <w:sz w:val="24"/>
+          <w:szCs w:val="24"/>
+        </w:rPr>
+        <w:t xml:space="preserve"> – </w:t>
+      </w:r>
+      <w:r>
+        <w:rPr>
+          <w:sz w:val="24"/>
+          <w:szCs w:val="24"/>
+        </w:rPr>
+        <w:t>loop through</w:t>
+      </w:r>
+      <w:r>
+        <w:rPr>
+          <w:sz w:val="24"/>
+          <w:szCs w:val="24"/>
+        </w:rPr>
+        <w:t xml:space="preserve"> – </w:t>
+      </w:r>
+      <w:r>
+        <w:rPr>
+          <w:sz w:val="24"/>
+          <w:szCs w:val="24"/>
+        </w:rPr>
+        <w:t xml:space="preserve">object. </w:t>
+      </w:r>
+      <w:r>
+        <w:rPr>
+          <w:sz w:val="24"/>
+          <w:szCs w:val="24"/>
+        </w:rPr>
+        <w:t>v</w:t>
+      </w:r>
+      <w:r>
+        <w:rPr>
+          <w:sz w:val="24"/>
+          <w:szCs w:val="24"/>
+        </w:rPr>
+        <w:t>alues</w:t>
+      </w:r>
+      <w:r>
+        <w:rPr>
+          <w:sz w:val="24"/>
+          <w:szCs w:val="24"/>
+        </w:rPr>
+        <w:t xml:space="preserve"> </w:t>
+      </w:r>
+      <w:r>
+        <w:rPr>
+          <w:sz w:val="24"/>
+          <w:szCs w:val="24"/>
+        </w:rPr>
+        <w:t>() – JSON.stringify(object name)</w:t>
+      </w:r>
+    </w:p>
+    <w:p>
+      <w:pPr>
+        <w:pStyle w:val="ListParagraph"/>
+        <w:numPr>
+          <w:ilvl w:val="2"/>
+          <w:numId w:val="1"/>
+        </w:numPr>
+        <w:rPr>
+          <w:color w:val="FF0000"/>
+          <w:sz w:val="24"/>
+          <w:szCs w:val="24"/>
+        </w:rPr>
+      </w:pPr>
+      <w:r>
+        <w:rPr>
+          <w:color w:val="FF0000"/>
+          <w:sz w:val="24"/>
+          <w:szCs w:val="24"/>
+        </w:rPr>
+        <w:t xml:space="preserve">While looping through object, we can’t get </w:t>
+      </w:r>
+      <w:r>
+        <w:rPr>
+          <w:color w:val="FF0000"/>
+          <w:sz w:val="24"/>
+          <w:szCs w:val="24"/>
+        </w:rPr>
+        <w:t xml:space="preserve">nested object </w:t>
+      </w:r>
+      <w:r>
+        <w:rPr>
+          <w:color w:val="FF0000"/>
+          <w:sz w:val="24"/>
+          <w:szCs w:val="24"/>
+        </w:rPr>
+        <w:t>value.</w:t>
+      </w:r>
+      <w:r>
+        <w:rPr>
+          <w:color w:val="FF0000"/>
+          <w:sz w:val="24"/>
+          <w:szCs w:val="24"/>
+        </w:rPr>
+        <w:t xml:space="preserve"> How to fix it</w:t>
+      </w:r>
+      <w:r>
+        <w:rPr>
+          <w:color w:val="FF0000"/>
+          <w:sz w:val="24"/>
+          <w:szCs w:val="24"/>
+        </w:rPr>
+        <w:t>?</w:t>
+      </w:r>
+    </w:p>
+    <w:p>
+      <w:pPr>
+        <w:pStyle w:val="ListParagraph"/>
+        <w:numPr>
+          <w:ilvl w:val="2"/>
+          <w:numId w:val="1"/>
+        </w:numPr>
+        <w:rPr>
+          <w:sz w:val="24"/>
+          <w:szCs w:val="24"/>
+        </w:rPr>
+      </w:pPr>
+      <w:r>
+        <w:rPr>
+          <w:sz w:val="24"/>
+          <w:szCs w:val="24"/>
+        </w:rPr>
+        <w:t>How to add/delete/update the properties of objects</w:t>
+      </w:r>
+    </w:p>
+    <w:p>
+      <w:pPr>
+        <w:pStyle w:val="ListParagraph"/>
+        <w:numPr>
+          <w:ilvl w:val="2"/>
+          <w:numId w:val="1"/>
+        </w:numPr>
+        <w:rPr>
+          <w:sz w:val="24"/>
+          <w:szCs w:val="24"/>
+        </w:rPr>
+      </w:pPr>
+      <w:r>
+        <w:rPr>
+          <w:sz w:val="24"/>
+          <w:szCs w:val="24"/>
+        </w:rPr>
+        <w:t>Property attributes</w:t>
+      </w:r>
+      <w:r>
+        <w:rPr>
+          <w:sz w:val="24"/>
+          <w:szCs w:val="24"/>
+        </w:rPr>
+        <w:t>/metadata</w:t>
+      </w:r>
+      <w:r>
+        <w:rPr>
+          <w:sz w:val="24"/>
+          <w:szCs w:val="24"/>
+        </w:rPr>
+        <w:t xml:space="preserve"> </w:t>
+      </w:r>
+      <w:r>
+        <w:rPr>
+          <w:sz w:val="24"/>
+          <w:szCs w:val="24"/>
+        </w:rPr>
+        <w:t>– writable, enumerable, configurable</w:t>
+      </w:r>
+    </w:p>
+    <w:p>
+      <w:pPr>
+        <w:pStyle w:val="ListParagraph"/>
+        <w:numPr>
+          <w:ilvl w:val="2"/>
+          <w:numId w:val="1"/>
+        </w:numPr>
+        <w:rPr>
+          <w:color w:val="FF0000"/>
+          <w:sz w:val="24"/>
+          <w:szCs w:val="24"/>
+        </w:rPr>
+      </w:pPr>
+      <w:r>
+        <w:rPr>
+          <w:color w:val="FF0000"/>
+          <w:sz w:val="24"/>
+          <w:szCs w:val="24"/>
+        </w:rPr>
+        <w:t>Prototype property and what will happen if we delete prototype property?</w:t>
+      </w:r>
+    </w:p>
+    <w:p>
+      <w:pPr>
+        <w:pStyle w:val="ListParagraph"/>
+        <w:numPr>
+          <w:ilvl w:val="1"/>
+          <w:numId w:val="1"/>
+        </w:numPr>
+        <w:rPr>
+          <w:sz w:val="24"/>
+          <w:szCs w:val="24"/>
+        </w:rPr>
+      </w:pPr>
+      <w:r>
+        <w:rPr>
+          <w:sz w:val="24"/>
+          <w:szCs w:val="24"/>
+        </w:rPr>
+        <w:t xml:space="preserve">Object Accessors </w:t>
+      </w:r>
+      <w:r>
+        <w:rPr>
+          <w:sz w:val="24"/>
+          <w:szCs w:val="24"/>
+        </w:rPr>
+        <w:t>–</w:t>
+      </w:r>
+      <w:r>
+        <w:rPr>
+          <w:sz w:val="24"/>
+          <w:szCs w:val="24"/>
+        </w:rPr>
+        <w:t xml:space="preserve"> </w:t>
+      </w:r>
+      <w:r>
+        <w:rPr>
+          <w:sz w:val="24"/>
+          <w:szCs w:val="24"/>
+        </w:rPr>
+        <w:t>Setters and Getters</w:t>
+      </w:r>
+    </w:p>
+    <w:p>
+      <w:pPr>
+        <w:pStyle w:val="ListParagraph"/>
+        <w:numPr>
+          <w:ilvl w:val="1"/>
+          <w:numId w:val="1"/>
+        </w:numPr>
+        <w:rPr>
+          <w:sz w:val="24"/>
+          <w:szCs w:val="24"/>
+        </w:rPr>
+      </w:pPr>
+      <w:r>
+        <w:rPr>
+          <w:sz w:val="24"/>
+          <w:szCs w:val="24"/>
+        </w:rPr>
+        <w:t>Object Constructor</w:t>
+      </w:r>
+      <w:r>
+        <w:rPr>
+          <w:sz w:val="24"/>
+          <w:szCs w:val="24"/>
+        </w:rPr>
+        <w:t xml:space="preserve"> (Object Constructor Function)</w:t>
+      </w:r>
+    </w:p>
+    <w:p>
+      <w:pPr>
+        <w:pStyle w:val="ListParagraph"/>
+        <w:numPr>
+          <w:ilvl w:val="2"/>
+          <w:numId w:val="1"/>
+        </w:numPr>
+        <w:rPr>
+          <w:sz w:val="24"/>
+          <w:szCs w:val="24"/>
+        </w:rPr>
+      </w:pPr>
+      <w:r>
+        <w:rPr>
+          <w:sz w:val="24"/>
+          <w:szCs w:val="24"/>
+        </w:rPr>
+        <w:t>How to add properties and methods to object</w:t>
+      </w:r>
+    </w:p>
+    <w:p>
+      <w:pPr>
+        <w:pStyle w:val="ListParagraph"/>
+        <w:numPr>
+          <w:ilvl w:val="2"/>
+          <w:numId w:val="1"/>
+        </w:numPr>
+        <w:rPr>
+          <w:sz w:val="24"/>
+          <w:szCs w:val="24"/>
+        </w:rPr>
+      </w:pPr>
+      <w:r>
+        <w:rPr>
+          <w:sz w:val="24"/>
+          <w:szCs w:val="24"/>
+        </w:rPr>
+        <w:t>How to add properties and methods to object constructor</w:t>
+      </w:r>
+    </w:p>
+    <w:p>
+      <w:pPr>
+        <w:pStyle w:val="ListParagraph"/>
+        <w:numPr>
+          <w:ilvl w:val="1"/>
+          <w:numId w:val="1"/>
+        </w:numPr>
+        <w:rPr>
+          <w:sz w:val="24"/>
+          <w:szCs w:val="24"/>
+        </w:rPr>
+      </w:pPr>
+      <w:r>
+        <w:rPr>
+          <w:sz w:val="24"/>
+          <w:szCs w:val="24"/>
+        </w:rPr>
+        <w:t>Object Prototype</w:t>
+      </w:r>
+    </w:p>
+    <w:p>
+      <w:pPr>
+        <w:pStyle w:val="ListParagraph"/>
+        <w:numPr>
+          <w:ilvl w:val="2"/>
+          <w:numId w:val="1"/>
+        </w:numPr>
+        <w:rPr>
+          <w:sz w:val="24"/>
+          <w:szCs w:val="24"/>
+        </w:rPr>
+      </w:pPr>
+      <w:r>
+        <w:rPr>
+          <w:sz w:val="24"/>
+          <w:szCs w:val="24"/>
+        </w:rPr>
+        <w:t>Prototype – Prototype chain</w:t>
+      </w:r>
+      <w:r>
+        <w:rPr>
+          <w:sz w:val="24"/>
+          <w:szCs w:val="24"/>
+        </w:rPr>
+        <w:t>/Prototypal inheritance</w:t>
+      </w:r>
+    </w:p>
+    <w:p>
+      <w:pPr>
+        <w:pStyle w:val="ListParagraph"/>
+        <w:numPr>
+          <w:ilvl w:val="2"/>
+          <w:numId w:val="1"/>
+        </w:numPr>
+        <w:rPr>
+          <w:sz w:val="24"/>
+          <w:szCs w:val="24"/>
+        </w:rPr>
+      </w:pPr>
+      <w:r>
+        <w:rPr>
+          <w:sz w:val="24"/>
+          <w:szCs w:val="24"/>
+        </w:rPr>
+        <w:t>How to add property and methods to object</w:t>
+      </w:r>
+      <w:r>
+        <w:rPr>
+          <w:sz w:val="24"/>
+          <w:szCs w:val="24"/>
+        </w:rPr>
+        <w:t xml:space="preserve"> constructor</w:t>
+      </w:r>
+      <w:r>
+        <w:rPr>
+          <w:sz w:val="24"/>
+          <w:szCs w:val="24"/>
+        </w:rPr>
+        <w:t xml:space="preserve"> using prototype</w:t>
+      </w:r>
+    </w:p>
+    <w:p>
+      <w:pPr>
+        <w:pStyle w:val="ListParagraph"/>
+        <w:numPr>
+          <w:ilvl w:val="1"/>
+          <w:numId w:val="1"/>
+        </w:numPr>
+        <w:rPr>
+          <w:sz w:val="24"/>
+          <w:szCs w:val="24"/>
+        </w:rPr>
+      </w:pPr>
+      <w:r>
+        <w:rPr>
+          <w:sz w:val="24"/>
+          <w:szCs w:val="24"/>
+        </w:rPr>
+        <w:t>Object Methods</w:t>
+      </w:r>
+      <w:r>
+        <w:rPr>
+          <w:sz w:val="24"/>
+          <w:szCs w:val="24"/>
+        </w:rPr>
+        <w:t xml:space="preserve"> –</w:t>
+      </w:r>
+      <w:r>
+        <w:rPr>
+          <w:sz w:val="24"/>
+          <w:szCs w:val="24"/>
+        </w:rPr>
+        <w:t xml:space="preserve"> </w:t>
       </w:r>
       <w:r>
         <w:rPr>
@@ -2273,6 +2287,24 @@
           <w:sz w:val="24"/>
           <w:szCs w:val="24"/>
         </w:rPr>
+        <w:t>[nearly 2</w:t>
+      </w:r>
+      <w:r>
+        <w:rPr>
+          <w:b/>
+          <w:bCs/>
+          <w:sz w:val="24"/>
+          <w:szCs w:val="24"/>
+        </w:rPr>
+        <w:t>7</w:t>
+      </w:r>
+      <w:r>
+        <w:rPr>
+          <w:b/>
+          <w:bCs/>
+          <w:sz w:val="24"/>
+          <w:szCs w:val="24"/>
+        </w:rPr>
         <w:t>]</w:t>
       </w:r>
     </w:p>
@@ -2304,12 +2336,14 @@
           <w:numId w:val="2"/>
         </w:numPr>
         <w:rPr>
-          <w:sz w:val="24"/>
-          <w:szCs w:val="24"/>
-        </w:rPr>
-      </w:pPr>
-      <w:r>
-        <w:rPr>
+          <w:color w:val="FF0000"/>
+          <w:sz w:val="24"/>
+          <w:szCs w:val="24"/>
+        </w:rPr>
+      </w:pPr>
+      <w:r>
+        <w:rPr>
+          <w:color w:val="FF0000"/>
           <w:sz w:val="24"/>
           <w:szCs w:val="24"/>
         </w:rPr>
@@ -2317,6 +2351,7 @@
       </w:r>
       <w:r>
         <w:rPr>
+          <w:color w:val="FF0000"/>
           <w:sz w:val="24"/>
           <w:szCs w:val="24"/>
         </w:rPr>
@@ -2324,6 +2359,7 @@
       </w:r>
       <w:r>
         <w:rPr>
+          <w:color w:val="FF0000"/>
           <w:sz w:val="24"/>
           <w:szCs w:val="24"/>
         </w:rPr>
@@ -2331,6 +2367,7 @@
       </w:r>
       <w:r>
         <w:rPr>
+          <w:color w:val="FF0000"/>
           <w:sz w:val="24"/>
           <w:szCs w:val="24"/>
         </w:rPr>
@@ -2338,6 +2375,7 @@
       </w:r>
       <w:r>
         <w:rPr>
+          <w:color w:val="FF0000"/>
           <w:sz w:val="24"/>
           <w:szCs w:val="24"/>
         </w:rPr>
@@ -2662,13 +2700,6 @@
           <w:sz w:val="24"/>
           <w:szCs w:val="24"/>
         </w:rPr>
-        <w:t xml:space="preserve">Function As </w:t>
-      </w:r>
-      <w:r>
-        <w:rPr>
-          <w:sz w:val="24"/>
-          <w:szCs w:val="24"/>
-        </w:rPr>
         <w:t>First Class Citizen</w:t>
       </w:r>
     </w:p>
@@ -2737,14 +2768,7 @@
           <w:sz w:val="24"/>
           <w:szCs w:val="24"/>
         </w:rPr>
-        <w:t xml:space="preserve">Function </w:t>
-      </w:r>
-      <w:r>
-        <w:rPr>
-          <w:sz w:val="24"/>
-          <w:szCs w:val="24"/>
-        </w:rPr>
-        <w:t>with ‘new’ keyword</w:t>
+        <w:t>Function Constructor</w:t>
       </w:r>
     </w:p>
     <w:p>
@@ -2764,14 +2788,7 @@
           <w:sz w:val="24"/>
           <w:szCs w:val="24"/>
         </w:rPr>
-        <w:t>Function Constructor</w:t>
-      </w:r>
-      <w:r>
-        <w:rPr>
-          <w:sz w:val="24"/>
-          <w:szCs w:val="24"/>
-        </w:rPr>
-        <w:t xml:space="preserve"> / Constructor Function</w:t>
+        <w:t>toString (), “arguments. length” property</w:t>
       </w:r>
     </w:p>
     <w:p>
@@ -2791,7 +2808,7 @@
           <w:sz w:val="24"/>
           <w:szCs w:val="24"/>
         </w:rPr>
-        <w:t>toString (), “arguments. length” property</w:t>
+        <w:t>Call, Apply, Bind Method</w:t>
       </w:r>
     </w:p>
     <w:p>
@@ -2811,34 +2828,7 @@
           <w:sz w:val="24"/>
           <w:szCs w:val="24"/>
         </w:rPr>
-        <w:t>Call, Apply, Bind Method</w:t>
-      </w:r>
-    </w:p>
-    <w:p>
-      <w:pPr>
-        <w:pStyle w:val="ListParagraph"/>
-        <w:numPr>
-          <w:ilvl w:val="1"/>
-          <w:numId w:val="2"/>
-        </w:numPr>
-        <w:rPr>
-          <w:sz w:val="24"/>
-          <w:szCs w:val="24"/>
-        </w:rPr>
-      </w:pPr>
-      <w:r>
-        <w:rPr>
-          <w:sz w:val="24"/>
-          <w:szCs w:val="24"/>
-        </w:rPr>
         <w:t>Arrow Function</w:t>
-      </w:r>
-      <w:r>
-        <w:rPr>
-          <w:sz w:val="24"/>
-          <w:szCs w:val="24"/>
-        </w:rPr>
-        <w:t xml:space="preserve"> / Lamba Expression in javascript</w:t>
       </w:r>
     </w:p>
     <w:p>
@@ -3161,26 +3151,6 @@
           <w:sz w:val="24"/>
           <w:szCs w:val="24"/>
         </w:rPr>
-        <w:t>Generic Function</w:t>
-      </w:r>
-    </w:p>
-    <w:p>
-      <w:pPr>
-        <w:pStyle w:val="ListParagraph"/>
-        <w:numPr>
-          <w:ilvl w:val="1"/>
-          <w:numId w:val="2"/>
-        </w:numPr>
-        <w:rPr>
-          <w:sz w:val="24"/>
-          <w:szCs w:val="24"/>
-        </w:rPr>
-      </w:pPr>
-      <w:r>
-        <w:rPr>
-          <w:sz w:val="24"/>
-          <w:szCs w:val="24"/>
-        </w:rPr>
         <w:t>Factory Function</w:t>
       </w:r>
     </w:p>
@@ -3668,7 +3638,6 @@
           <w:sz w:val="24"/>
           <w:szCs w:val="24"/>
         </w:rPr>
-        <w:lastRenderedPageBreak/>
         <w:t>Spread operator</w:t>
       </w:r>
       <w:r>
@@ -3716,6 +3685,7 @@
           <w:sz w:val="24"/>
           <w:szCs w:val="24"/>
         </w:rPr>
+        <w:lastRenderedPageBreak/>
         <w:t>Object Literals</w:t>
       </w:r>
     </w:p>
@@ -4006,14 +3976,7 @@
           <w:sz w:val="24"/>
           <w:szCs w:val="24"/>
         </w:rPr>
-        <w:t>Block</w:t>
-      </w:r>
-      <w:r>
-        <w:rPr>
-          <w:sz w:val="24"/>
-          <w:szCs w:val="24"/>
-        </w:rPr>
-        <w:t xml:space="preserve"> string</w:t>
+        <w:t>Multi-line string</w:t>
       </w:r>
     </w:p>
     <w:p>
@@ -4847,7 +4810,6 @@
           <w:sz w:val="24"/>
           <w:szCs w:val="24"/>
         </w:rPr>
-        <w:lastRenderedPageBreak/>
         <w:t>How to create map</w:t>
       </w:r>
     </w:p>
@@ -4913,6 +4875,7 @@
           <w:sz w:val="24"/>
           <w:szCs w:val="24"/>
         </w:rPr>
+        <w:lastRenderedPageBreak/>
         <w:t>Difference between Maps and Objects</w:t>
       </w:r>
     </w:p>

</xml_diff>